<commit_message>
Atualiza documentacao com diagrama de casos de uso
</commit_message>
<xml_diff>
--- a/docs/4710499_Projeto_Back_End.docx
+++ b/docs/4710499_Projeto_Back_End.docx
@@ -66,6 +66,37 @@
         <w:t>End</w:t>
       </w:r>
       <w:proofErr w:type="spellEnd"/>
+      <w:r>
+        <w:rPr>
+          <w:rFonts w:asciiTheme="minorHAnsi" w:hAnsiTheme="minorHAnsi" w:cstheme="majorHAnsi"/>
+          <w:sz w:val="22"/>
+          <w:lang w:val="pt-BR"/>
+        </w:rPr>
+        <w:br/>
+      </w:r>
+      <w:r>
+        <w:rPr>
+          <w:rFonts w:asciiTheme="minorHAnsi" w:hAnsiTheme="minorHAnsi" w:cstheme="majorHAnsi"/>
+          <w:lang w:val="pt-BR"/>
+        </w:rPr>
+        <w:t xml:space="preserve">Prof. Me. Luciane </w:t>
+      </w:r>
+      <w:proofErr w:type="spellStart"/>
+      <w:r>
+        <w:rPr>
+          <w:rFonts w:asciiTheme="minorHAnsi" w:hAnsiTheme="minorHAnsi" w:cstheme="majorHAnsi"/>
+          <w:lang w:val="pt-BR"/>
+        </w:rPr>
+        <w:t>Yanase</w:t>
+      </w:r>
+      <w:proofErr w:type="spellEnd"/>
+      <w:r>
+        <w:rPr>
+          <w:rFonts w:asciiTheme="minorHAnsi" w:hAnsiTheme="minorHAnsi" w:cstheme="majorHAnsi"/>
+          <w:lang w:val="pt-BR"/>
+        </w:rPr>
+        <w:t xml:space="preserve"> Kanashiro</w:t>
+      </w:r>
     </w:p>
     <w:p>
       <w:pPr>
@@ -2248,6 +2279,54 @@
     </w:p>
     <w:p>
       <w:pPr>
+        <w:rPr>
+          <w:lang w:val="pt-BR"/>
+        </w:rPr>
+      </w:pPr>
+      <w:r>
+        <w:rPr>
+          <w:noProof/>
+          <w:lang w:val="pt-BR"/>
+        </w:rPr>
+        <w:drawing>
+          <wp:inline distT="0" distB="0" distL="0" distR="0" wp14:anchorId="49186DD3" wp14:editId="59D14988">
+            <wp:extent cx="5972810" cy="3749040"/>
+            <wp:effectExtent l="0" t="0" r="8890" b="3810"/>
+            <wp:docPr id="1449559212" name="Imagem 1"/>
+            <wp:cNvGraphicFramePr>
+              <a:graphicFrameLocks xmlns:a="http://schemas.openxmlformats.org/drawingml/2006/main" noChangeAspect="1"/>
+            </wp:cNvGraphicFramePr>
+            <a:graphic xmlns:a="http://schemas.openxmlformats.org/drawingml/2006/main">
+              <a:graphicData uri="http://schemas.openxmlformats.org/drawingml/2006/picture">
+                <pic:pic xmlns:pic="http://schemas.openxmlformats.org/drawingml/2006/picture">
+                  <pic:nvPicPr>
+                    <pic:cNvPr id="1449559212" name="Imagem 1449559212"/>
+                    <pic:cNvPicPr/>
+                  </pic:nvPicPr>
+                  <pic:blipFill>
+                    <a:blip r:embed="rId7"/>
+                    <a:stretch>
+                      <a:fillRect/>
+                    </a:stretch>
+                  </pic:blipFill>
+                  <pic:spPr>
+                    <a:xfrm>
+                      <a:off x="0" y="0"/>
+                      <a:ext cx="5972810" cy="3749040"/>
+                    </a:xfrm>
+                    <a:prstGeom prst="rect">
+                      <a:avLst/>
+                    </a:prstGeom>
+                  </pic:spPr>
+                </pic:pic>
+              </a:graphicData>
+            </a:graphic>
+          </wp:inline>
+        </w:drawing>
+      </w:r>
+    </w:p>
+    <w:p>
+      <w:pPr>
         <w:spacing w:after="100"/>
         <w:rPr>
           <w:rFonts w:asciiTheme="minorHAnsi" w:hAnsiTheme="minorHAnsi"/>
@@ -2259,6 +2338,7 @@
           <w:rFonts w:asciiTheme="minorHAnsi" w:hAnsiTheme="minorHAnsi"/>
           <w:lang w:val="pt-BR"/>
         </w:rPr>
+        <w:lastRenderedPageBreak/>
         <w:t xml:space="preserve">O sistema possui três atores principais: Cliente (App/Totem), Atendente (Balcão) </w:t>
       </w:r>
       <w:proofErr w:type="gramStart"/>
@@ -2548,7 +2628,6 @@
           <w:rFonts w:asciiTheme="minorHAnsi" w:hAnsiTheme="minorHAnsi"/>
           <w:lang w:val="pt-BR"/>
         </w:rPr>
-        <w:lastRenderedPageBreak/>
         <w:t xml:space="preserve">- </w:t>
       </w:r>
       <w:proofErr w:type="spellStart"/>
@@ -3353,6 +3432,7 @@
           <w:rFonts w:asciiTheme="minorHAnsi" w:hAnsiTheme="minorHAnsi"/>
           <w:lang w:val="pt-BR"/>
         </w:rPr>
+        <w:lastRenderedPageBreak/>
         <w:t>SituacaoPedido</w:t>
       </w:r>
       <w:proofErr w:type="spellEnd"/>
@@ -3842,7 +3922,6 @@
         <w:rPr>
           <w:rFonts w:cstheme="majorHAnsi"/>
         </w:rPr>
-        <w:lastRenderedPageBreak/>
         <w:t xml:space="preserve">2.5 </w:t>
       </w:r>
       <w:proofErr w:type="spellStart"/>
@@ -4511,6 +4590,7 @@
           <w:rFonts w:asciiTheme="minorHAnsi" w:hAnsiTheme="minorHAnsi"/>
           <w:lang w:val="pt-BR"/>
         </w:rPr>
+        <w:lastRenderedPageBreak/>
         <w:t>Pré-condições: (1) Usuário autenticado com token JWT válido. (2) Cliente, Unidade e Produto(s) com ids existentes e estoque suficiente.</w:t>
       </w:r>
     </w:p>
@@ -4728,7 +4808,6 @@
           <w:rFonts w:cstheme="majorHAnsi"/>
           <w:lang w:val="pt-BR"/>
         </w:rPr>
-        <w:lastRenderedPageBreak/>
         <w:t>3. DOCUMENTAÇÃO DOS ENDPOINTS</w:t>
       </w:r>
     </w:p>
@@ -5266,6 +5345,7 @@
           <w:rFonts w:cstheme="majorHAnsi"/>
           <w:lang w:val="pt-BR"/>
         </w:rPr>
+        <w:lastRenderedPageBreak/>
         <w:t>3.3 Pedidos — Criar Pedido (fluxo crítico)</w:t>
       </w:r>
     </w:p>
@@ -5580,7 +5660,6 @@
           <w:rFonts w:cstheme="majorHAnsi"/>
           <w:lang w:val="pt-BR"/>
         </w:rPr>
-        <w:lastRenderedPageBreak/>
         <w:t>3.6 Pagamentos — Processar Pagamento (</w:t>
       </w:r>
       <w:proofErr w:type="spellStart"/>
@@ -6033,6 +6112,7 @@
         <w:rPr>
           <w:rFonts w:asciiTheme="minorHAnsi" w:hAnsiTheme="minorHAnsi"/>
         </w:rPr>
+        <w:lastRenderedPageBreak/>
         <w:t>- Build: Apache Maven 3.9.6</w:t>
       </w:r>
     </w:p>
@@ -6273,7 +6353,6 @@
           <w:rFonts w:cstheme="majorHAnsi"/>
           <w:lang w:val="pt-BR"/>
         </w:rPr>
-        <w:lastRenderedPageBreak/>
         <w:t xml:space="preserve">4.3 Multicanalidade com </w:t>
       </w:r>
       <w:proofErr w:type="spellStart"/>
@@ -7027,6 +7106,7 @@
           <w:rFonts w:cstheme="majorHAnsi"/>
           <w:lang w:val="pt-BR"/>
         </w:rPr>
+        <w:lastRenderedPageBreak/>
         <w:t xml:space="preserve">4.5 Persistência e </w:t>
       </w:r>
       <w:proofErr w:type="spellStart"/>
@@ -7212,15 +7292,7 @@
           <w:rFonts w:asciiTheme="minorHAnsi" w:hAnsiTheme="minorHAnsi"/>
           <w:lang w:val="pt-BR"/>
         </w:rPr>
-        <w:t xml:space="preserve">. Requisições sem </w:t>
-      </w:r>
-      <w:r>
-        <w:rPr>
-          <w:rFonts w:asciiTheme="minorHAnsi" w:hAnsiTheme="minorHAnsi"/>
-          <w:lang w:val="pt-BR"/>
-        </w:rPr>
-        <w:lastRenderedPageBreak/>
-        <w:t xml:space="preserve">token são rejeitadas com 401 (NAO_AUTENTICADO) via </w:t>
+        <w:t xml:space="preserve">. Requisições sem token são rejeitadas com 401 (NAO_AUTENTICADO) via </w:t>
       </w:r>
       <w:proofErr w:type="spellStart"/>
       <w:r>
@@ -7559,6 +7631,7 @@
           <w:rFonts w:cstheme="majorHAnsi"/>
           <w:lang w:val="pt-BR"/>
         </w:rPr>
+        <w:lastRenderedPageBreak/>
         <w:t>5.4 Logs e Auditoria</w:t>
       </w:r>
     </w:p>
@@ -7772,7 +7845,6 @@
                 <w:color w:val="FFFFFF"/>
                 <w:sz w:val="18"/>
               </w:rPr>
-              <w:lastRenderedPageBreak/>
               <w:t>ID</w:t>
             </w:r>
           </w:p>
@@ -9237,6 +9309,7 @@
           <w:rFonts w:cstheme="majorHAnsi"/>
           <w:lang w:val="pt-BR"/>
         </w:rPr>
+        <w:lastRenderedPageBreak/>
         <w:t>6.3 Evidências de Execução (Confirmadas em Ambiente Real)</w:t>
       </w:r>
     </w:p>
@@ -9621,7 +9694,6 @@
           <w:rFonts w:asciiTheme="minorHAnsi" w:hAnsiTheme="minorHAnsi"/>
           <w:lang w:val="pt-BR"/>
         </w:rPr>
-        <w:lastRenderedPageBreak/>
         <w:t>T10 – Reprocessamento (409)</w:t>
       </w:r>
     </w:p>
@@ -10252,6 +10324,7 @@
           <w:sz w:val="18"/>
           <w:lang w:val="pt-BR"/>
         </w:rPr>
+        <w:lastRenderedPageBreak/>
         <w:t xml:space="preserve">    </w:t>
       </w:r>
       <w:proofErr w:type="spellStart"/>
@@ -10877,7 +10950,6 @@
           <w:rFonts w:cstheme="majorHAnsi"/>
           <w:lang w:val="pt-BR"/>
         </w:rPr>
-        <w:lastRenderedPageBreak/>
         <w:t>7.3 README</w:t>
       </w:r>
     </w:p>
@@ -11181,6 +11253,7 @@
           <w:rFonts w:asciiTheme="minorHAnsi" w:hAnsiTheme="minorHAnsi"/>
           <w:lang w:val="pt-BR"/>
         </w:rPr>
+        <w:lastRenderedPageBreak/>
         <w:t>- ConfiguracaoSeguranca.java: adicionada liberação de /h2-console/** no filtro de segurança; desativado X-Frame-Options para permitir a interface iframe do H2 Console.</w:t>
       </w:r>
     </w:p>
@@ -11342,7 +11415,6 @@
           <w:color w:val="1F3864"/>
           <w:lang w:val="pt-BR"/>
         </w:rPr>
-        <w:lastRenderedPageBreak/>
         <w:t>Repositorio</w:t>
       </w:r>
       <w:proofErr w:type="spellEnd"/>
@@ -11355,7 +11427,7 @@
         </w:rPr>
         <w:t xml:space="preserve"> GitHub: </w:t>
       </w:r>
-      <w:hyperlink r:id="rId7" w:history="1">
+      <w:hyperlink r:id="rId8" w:history="1">
         <w:r>
           <w:rPr>
             <w:rStyle w:val="Hyperlink"/>
@@ -11363,25 +11435,7 @@
             <w:b/>
             <w:lang w:val="pt-BR"/>
           </w:rPr>
-          <w:t>https://github.com/PedroMe</w:t>
-        </w:r>
-        <w:r>
-          <w:rPr>
-            <w:rStyle w:val="Hyperlink"/>
-            <w:rFonts w:asciiTheme="majorHAnsi" w:hAnsiTheme="majorHAnsi" w:cstheme="majorHAnsi"/>
-            <w:b/>
-            <w:lang w:val="pt-BR"/>
-          </w:rPr>
-          <w:t>s</w:t>
-        </w:r>
-        <w:r>
-          <w:rPr>
-            <w:rStyle w:val="Hyperlink"/>
-            <w:rFonts w:asciiTheme="majorHAnsi" w:hAnsiTheme="majorHAnsi" w:cstheme="majorHAnsi"/>
-            <w:b/>
-            <w:lang w:val="pt-BR"/>
-          </w:rPr>
-          <w:t>quita7/raizes-nordeste-backend.git</w:t>
+          <w:t>https://github.com/PedroMesquita7/raizes-nordeste-backend.git</w:t>
         </w:r>
       </w:hyperlink>
     </w:p>
@@ -11635,6 +11689,7 @@
           <w:rFonts w:asciiTheme="minorHAnsi" w:hAnsiTheme="minorHAnsi"/>
           <w:lang w:val="pt-BR"/>
         </w:rPr>
+        <w:lastRenderedPageBreak/>
         <w:t xml:space="preserve">O gateway de pagamento </w:t>
       </w:r>
       <w:proofErr w:type="spellStart"/>
@@ -13240,6 +13295,7 @@
   <w:style w:type="character" w:default="1" w:styleId="Fontepargpadro">
     <w:name w:val="Default Paragraph Font"/>
     <w:uiPriority w:val="1"/>
+    <w:semiHidden/>
     <w:unhideWhenUsed/>
   </w:style>
   <w:style w:type="table" w:default="1" w:styleId="Tabelanormal">

</xml_diff>